<commit_message>
lab3 layout + screenshots
</commit_message>
<xml_diff>
--- a/sem_5/RIP/screenshots/lab_3.docx
+++ b/sem_5/RIP/screenshots/lab_3.docx
@@ -3,7 +3,83 @@
 <w:document xmlns:wpc="http://schemas.microsoft.com/office/word/2010/wordprocessingCanvas" xmlns:mc="http://schemas.openxmlformats.org/markup-compatibility/2006" xmlns:o="urn:schemas-microsoft-com:office:office" xmlns:r="http://schemas.openxmlformats.org/officeDocument/2006/relationships" xmlns:m="http://schemas.openxmlformats.org/officeDocument/2006/math" xmlns:v="urn:schemas-microsoft-com:vml" xmlns:wp14="http://schemas.microsoft.com/office/word/2010/wordprocessingDrawing" xmlns:wp="http://schemas.openxmlformats.org/drawingml/2006/wordprocessingDrawing" xmlns:w10="urn:schemas-microsoft-com:office:word" xmlns:w="http://schemas.openxmlformats.org/wordprocessingml/2006/main" xmlns:w14="http://schemas.microsoft.com/office/word/2010/wordml" xmlns:w15="http://schemas.microsoft.com/office/word/2012/wordml" xmlns:wpg="http://schemas.microsoft.com/office/word/2010/wordprocessingGroup" xmlns:wpi="http://schemas.microsoft.com/office/word/2010/wordprocessingInk" xmlns:wne="http://schemas.microsoft.com/office/word/2006/wordml" xmlns:wps="http://schemas.microsoft.com/office/word/2010/wordprocessingShape" mc:Ignorable="w14 w15 wp14">
   <w:body>
     <w:p>
-      <w:r>
+      <w:pPr>
+        <w:jc w:val="center"/>
+      </w:pPr>
+      <w:r>
+        <w:drawing>
+          <wp:inline distT="0" distB="0" distL="0" distR="0" wp14:anchorId="41EED151" wp14:editId="6743FD0C">
+            <wp:extent cx="4124901" cy="4067743"/>
+            <wp:effectExtent l="0" t="0" r="9525" b="9525"/>
+            <wp:docPr id="1" name="Рисунок 1"/>
+            <wp:cNvGraphicFramePr>
+              <a:graphicFrameLocks xmlns:a="http://schemas.openxmlformats.org/drawingml/2006/main" noChangeAspect="1"/>
+            </wp:cNvGraphicFramePr>
+            <a:graphic xmlns:a="http://schemas.openxmlformats.org/drawingml/2006/main">
+              <a:graphicData uri="http://schemas.openxmlformats.org/drawingml/2006/picture">
+                <pic:pic xmlns:pic="http://schemas.openxmlformats.org/drawingml/2006/picture">
+                  <pic:nvPicPr>
+                    <pic:cNvPr id="1" name=""/>
+                    <pic:cNvPicPr/>
+                  </pic:nvPicPr>
+                  <pic:blipFill>
+                    <a:blip r:embed="rId4"/>
+                    <a:stretch>
+                      <a:fillRect/>
+                    </a:stretch>
+                  </pic:blipFill>
+                  <pic:spPr>
+                    <a:xfrm>
+                      <a:off x="0" y="0"/>
+                      <a:ext cx="4124901" cy="4067743"/>
+                    </a:xfrm>
+                    <a:prstGeom prst="rect">
+                      <a:avLst/>
+                    </a:prstGeom>
+                  </pic:spPr>
+                </pic:pic>
+              </a:graphicData>
+            </a:graphic>
+          </wp:inline>
+        </w:drawing>
+      </w:r>
+      <w:bookmarkStart w:id="0" w:name="_GoBack"/>
+      <w:bookmarkEnd w:id="0"/>
+    </w:p>
+    <w:p>
+      <w:pPr>
+        <w:jc w:val="center"/>
+        <w:rPr>
+          <w:rFonts w:ascii="Times New Roman" w:hAnsi="Times New Roman" w:cs="Times New Roman"/>
+          <w:i/>
+          <w:sz w:val="28"/>
+          <w:szCs w:val="28"/>
+        </w:rPr>
+      </w:pPr>
+      <w:r>
+        <w:rPr>
+          <w:rFonts w:ascii="Times New Roman" w:hAnsi="Times New Roman" w:cs="Times New Roman"/>
+          <w:i/>
+          <w:sz w:val="28"/>
+          <w:szCs w:val="28"/>
+        </w:rPr>
+        <w:t>Рис. 1 – коллекция запросов</w:t>
+      </w:r>
+    </w:p>
+    <w:p>
+      <w:pPr>
+        <w:jc w:val="center"/>
+        <w:rPr>
+          <w:rFonts w:ascii="Times New Roman" w:hAnsi="Times New Roman" w:cs="Times New Roman"/>
+          <w:i/>
+          <w:sz w:val="28"/>
+          <w:szCs w:val="28"/>
+        </w:rPr>
+      </w:pPr>
+    </w:p>
+    <w:p>
+      <w:r>
+        <w:lastRenderedPageBreak/>
         <w:pict>
           <v:shapetype id="_x0000_t75" coordsize="21600,21600" o:spt="75" o:preferrelative="t" path="m@4@5l@4@11@9@11@9@5xe" filled="f" stroked="f">
             <v:stroke joinstyle="miter"/>
@@ -24,30 +100,39 @@
             <v:path o:extrusionok="f" gradientshapeok="t" o:connecttype="rect"/>
             <o:lock v:ext="edit" aspectratio="t"/>
           </v:shapetype>
-          <v:shape id="_x0000_i1025" type="#_x0000_t75" style="width:467.5pt;height:370.45pt">
-            <v:imagedata r:id="rId4" o:title="1"/>
-          </v:shape>
-        </w:pict>
-      </w:r>
-    </w:p>
-    <w:p>
-      <w:pPr>
-        <w:jc w:val="center"/>
-        <w:rPr>
-          <w:rFonts w:ascii="Times New Roman" w:hAnsi="Times New Roman" w:cs="Times New Roman"/>
-          <w:i/>
-          <w:sz w:val="28"/>
-          <w:szCs w:val="28"/>
-        </w:rPr>
-      </w:pPr>
-      <w:r>
-        <w:rPr>
-          <w:rFonts w:ascii="Times New Roman" w:hAnsi="Times New Roman" w:cs="Times New Roman"/>
-          <w:i/>
-          <w:sz w:val="28"/>
-          <w:szCs w:val="28"/>
-        </w:rPr>
-        <w:t>Рис. 1 - GET списка услуг (с фильтром)</w:t>
+          <v:shape id="_x0000_i1025" type="#_x0000_t75" style="width:467.4pt;height:370.2pt">
+            <v:imagedata r:id="rId5" o:title="1"/>
+          </v:shape>
+        </w:pict>
+      </w:r>
+    </w:p>
+    <w:p>
+      <w:pPr>
+        <w:jc w:val="center"/>
+        <w:rPr>
+          <w:rFonts w:ascii="Times New Roman" w:hAnsi="Times New Roman" w:cs="Times New Roman"/>
+          <w:i/>
+          <w:sz w:val="28"/>
+          <w:szCs w:val="28"/>
+        </w:rPr>
+      </w:pPr>
+      <w:r>
+        <w:rPr>
+          <w:rFonts w:ascii="Times New Roman" w:hAnsi="Times New Roman" w:cs="Times New Roman"/>
+          <w:i/>
+          <w:sz w:val="28"/>
+          <w:szCs w:val="28"/>
+        </w:rPr>
+        <w:t>Рис. 2</w:t>
+      </w:r>
+      <w:r>
+        <w:rPr>
+          <w:rFonts w:ascii="Times New Roman" w:hAnsi="Times New Roman" w:cs="Times New Roman"/>
+          <w:i/>
+          <w:sz w:val="28"/>
+          <w:szCs w:val="28"/>
+        </w:rPr>
+        <w:t xml:space="preserve"> - GET списка услуг (с фильтром)</w:t>
       </w:r>
     </w:p>
     <w:p>
@@ -63,30 +148,39 @@
         </w:rPr>
         <w:lastRenderedPageBreak/>
         <w:pict>
-          <v:shape id="_x0000_i1026" type="#_x0000_t75" style="width:466.95pt;height:370.45pt">
-            <v:imagedata r:id="rId5" o:title="2"/>
-          </v:shape>
-        </w:pict>
-      </w:r>
-    </w:p>
-    <w:p>
-      <w:pPr>
-        <w:jc w:val="center"/>
-        <w:rPr>
-          <w:rFonts w:ascii="Times New Roman" w:hAnsi="Times New Roman" w:cs="Times New Roman"/>
-          <w:i/>
-          <w:sz w:val="28"/>
-          <w:szCs w:val="28"/>
-        </w:rPr>
-      </w:pPr>
-      <w:r>
-        <w:rPr>
-          <w:rFonts w:ascii="Times New Roman" w:hAnsi="Times New Roman" w:cs="Times New Roman"/>
-          <w:i/>
-          <w:sz w:val="28"/>
-          <w:szCs w:val="28"/>
-        </w:rPr>
-        <w:t>Рис. 2 - добавить новую услугу с картинкой и видео</w:t>
+          <v:shape id="_x0000_i1026" type="#_x0000_t75" style="width:467.4pt;height:370.8pt">
+            <v:imagedata r:id="rId6" o:title="2"/>
+          </v:shape>
+        </w:pict>
+      </w:r>
+    </w:p>
+    <w:p>
+      <w:pPr>
+        <w:jc w:val="center"/>
+        <w:rPr>
+          <w:rFonts w:ascii="Times New Roman" w:hAnsi="Times New Roman" w:cs="Times New Roman"/>
+          <w:i/>
+          <w:sz w:val="28"/>
+          <w:szCs w:val="28"/>
+        </w:rPr>
+      </w:pPr>
+      <w:r>
+        <w:rPr>
+          <w:rFonts w:ascii="Times New Roman" w:hAnsi="Times New Roman" w:cs="Times New Roman"/>
+          <w:i/>
+          <w:sz w:val="28"/>
+          <w:szCs w:val="28"/>
+        </w:rPr>
+        <w:t>Рис. 3</w:t>
+      </w:r>
+      <w:r>
+        <w:rPr>
+          <w:rFonts w:ascii="Times New Roman" w:hAnsi="Times New Roman" w:cs="Times New Roman"/>
+          <w:i/>
+          <w:sz w:val="28"/>
+          <w:szCs w:val="28"/>
+        </w:rPr>
+        <w:t xml:space="preserve"> - добавить новую услугу с картинкой и видео</w:t>
       </w:r>
     </w:p>
     <w:p>
@@ -102,30 +196,39 @@
         </w:rPr>
         <w:lastRenderedPageBreak/>
         <w:pict>
-          <v:shape id="_x0000_i1027" type="#_x0000_t75" style="width:466.95pt;height:370.95pt">
-            <v:imagedata r:id="rId6" o:title="3"/>
-          </v:shape>
-        </w:pict>
-      </w:r>
-    </w:p>
-    <w:p>
-      <w:pPr>
-        <w:jc w:val="center"/>
-        <w:rPr>
-          <w:rFonts w:ascii="Times New Roman" w:hAnsi="Times New Roman" w:cs="Times New Roman"/>
-          <w:i/>
-          <w:sz w:val="28"/>
-          <w:szCs w:val="28"/>
-        </w:rPr>
-      </w:pPr>
-      <w:r>
-        <w:rPr>
-          <w:rFonts w:ascii="Times New Roman" w:hAnsi="Times New Roman" w:cs="Times New Roman"/>
-          <w:i/>
-          <w:sz w:val="28"/>
-          <w:szCs w:val="28"/>
-        </w:rPr>
-        <w:t>Рис. 3 - получение поля черновика</w:t>
+          <v:shape id="_x0000_i1027" type="#_x0000_t75" style="width:467.4pt;height:370.8pt">
+            <v:imagedata r:id="rId7" o:title="3"/>
+          </v:shape>
+        </w:pict>
+      </w:r>
+    </w:p>
+    <w:p>
+      <w:pPr>
+        <w:jc w:val="center"/>
+        <w:rPr>
+          <w:rFonts w:ascii="Times New Roman" w:hAnsi="Times New Roman" w:cs="Times New Roman"/>
+          <w:i/>
+          <w:sz w:val="28"/>
+          <w:szCs w:val="28"/>
+        </w:rPr>
+      </w:pPr>
+      <w:r>
+        <w:rPr>
+          <w:rFonts w:ascii="Times New Roman" w:hAnsi="Times New Roman" w:cs="Times New Roman"/>
+          <w:i/>
+          <w:sz w:val="28"/>
+          <w:szCs w:val="28"/>
+        </w:rPr>
+        <w:t>Рис. 4</w:t>
+      </w:r>
+      <w:r>
+        <w:rPr>
+          <w:rFonts w:ascii="Times New Roman" w:hAnsi="Times New Roman" w:cs="Times New Roman"/>
+          <w:i/>
+          <w:sz w:val="28"/>
+          <w:szCs w:val="28"/>
+        </w:rPr>
+        <w:t xml:space="preserve"> - получение поля черновика</w:t>
       </w:r>
     </w:p>
     <w:p>
@@ -147,30 +250,39 @@
         </w:rPr>
         <w:lastRenderedPageBreak/>
         <w:pict>
-          <v:shape id="_x0000_i1028" type="#_x0000_t75" style="width:467.5pt;height:373.55pt">
-            <v:imagedata r:id="rId7" o:title="4"/>
-          </v:shape>
-        </w:pict>
-      </w:r>
-    </w:p>
-    <w:p>
-      <w:pPr>
-        <w:jc w:val="center"/>
-        <w:rPr>
-          <w:rFonts w:ascii="Times New Roman" w:hAnsi="Times New Roman" w:cs="Times New Roman"/>
-          <w:i/>
-          <w:sz w:val="28"/>
-          <w:szCs w:val="28"/>
-        </w:rPr>
-      </w:pPr>
-      <w:r>
-        <w:rPr>
-          <w:rFonts w:ascii="Times New Roman" w:hAnsi="Times New Roman" w:cs="Times New Roman"/>
-          <w:i/>
-          <w:sz w:val="28"/>
-          <w:szCs w:val="28"/>
-        </w:rPr>
-        <w:t xml:space="preserve">Рис. 4 - </w:t>
+          <v:shape id="_x0000_i1028" type="#_x0000_t75" style="width:467.4pt;height:373.2pt">
+            <v:imagedata r:id="rId8" o:title="4"/>
+          </v:shape>
+        </w:pict>
+      </w:r>
+    </w:p>
+    <w:p>
+      <w:pPr>
+        <w:jc w:val="center"/>
+        <w:rPr>
+          <w:rFonts w:ascii="Times New Roman" w:hAnsi="Times New Roman" w:cs="Times New Roman"/>
+          <w:i/>
+          <w:sz w:val="28"/>
+          <w:szCs w:val="28"/>
+        </w:rPr>
+      </w:pPr>
+      <w:r>
+        <w:rPr>
+          <w:rFonts w:ascii="Times New Roman" w:hAnsi="Times New Roman" w:cs="Times New Roman"/>
+          <w:i/>
+          <w:sz w:val="28"/>
+          <w:szCs w:val="28"/>
+        </w:rPr>
+        <w:t>Рис. 5</w:t>
+      </w:r>
+      <w:r>
+        <w:rPr>
+          <w:rFonts w:ascii="Times New Roman" w:hAnsi="Times New Roman" w:cs="Times New Roman"/>
+          <w:i/>
+          <w:sz w:val="28"/>
+          <w:szCs w:val="28"/>
+        </w:rPr>
+        <w:t xml:space="preserve"> - </w:t>
       </w:r>
       <w:r>
         <w:rPr>
@@ -201,30 +313,39 @@
         </w:rPr>
         <w:lastRenderedPageBreak/>
         <w:pict>
-          <v:shape id="_x0000_i1029" type="#_x0000_t75" style="width:467.5pt;height:370.95pt">
-            <v:imagedata r:id="rId8" o:title="5"/>
-          </v:shape>
-        </w:pict>
-      </w:r>
-    </w:p>
-    <w:p>
-      <w:pPr>
-        <w:jc w:val="center"/>
-        <w:rPr>
-          <w:rFonts w:ascii="Times New Roman" w:hAnsi="Times New Roman" w:cs="Times New Roman"/>
-          <w:i/>
-          <w:sz w:val="28"/>
-          <w:szCs w:val="28"/>
-        </w:rPr>
-      </w:pPr>
-      <w:r>
-        <w:rPr>
-          <w:rFonts w:ascii="Times New Roman" w:hAnsi="Times New Roman" w:cs="Times New Roman"/>
-          <w:i/>
-          <w:sz w:val="28"/>
-          <w:szCs w:val="28"/>
-        </w:rPr>
-        <w:t xml:space="preserve">Рис. 5 - </w:t>
+          <v:shape id="_x0000_i1029" type="#_x0000_t75" style="width:467.4pt;height:370.8pt">
+            <v:imagedata r:id="rId9" o:title="5"/>
+          </v:shape>
+        </w:pict>
+      </w:r>
+    </w:p>
+    <w:p>
+      <w:pPr>
+        <w:jc w:val="center"/>
+        <w:rPr>
+          <w:rFonts w:ascii="Times New Roman" w:hAnsi="Times New Roman" w:cs="Times New Roman"/>
+          <w:i/>
+          <w:sz w:val="28"/>
+          <w:szCs w:val="28"/>
+        </w:rPr>
+      </w:pPr>
+      <w:r>
+        <w:rPr>
+          <w:rFonts w:ascii="Times New Roman" w:hAnsi="Times New Roman" w:cs="Times New Roman"/>
+          <w:i/>
+          <w:sz w:val="28"/>
+          <w:szCs w:val="28"/>
+        </w:rPr>
+        <w:t>Рис. 6</w:t>
+      </w:r>
+      <w:r>
+        <w:rPr>
+          <w:rFonts w:ascii="Times New Roman" w:hAnsi="Times New Roman" w:cs="Times New Roman"/>
+          <w:i/>
+          <w:sz w:val="28"/>
+          <w:szCs w:val="28"/>
+        </w:rPr>
+        <w:t xml:space="preserve"> - </w:t>
       </w:r>
       <w:r>
         <w:rPr>
@@ -255,30 +376,39 @@
         </w:rPr>
         <w:lastRenderedPageBreak/>
         <w:pict>
-          <v:shape id="_x0000_i1030" type="#_x0000_t75" style="width:466.95pt;height:371.5pt">
-            <v:imagedata r:id="rId9" o:title="6"/>
-          </v:shape>
-        </w:pict>
-      </w:r>
-    </w:p>
-    <w:p>
-      <w:pPr>
-        <w:jc w:val="center"/>
-        <w:rPr>
-          <w:rFonts w:ascii="Times New Roman" w:hAnsi="Times New Roman" w:cs="Times New Roman"/>
-          <w:i/>
-          <w:sz w:val="28"/>
-          <w:szCs w:val="28"/>
-        </w:rPr>
-      </w:pPr>
-      <w:r>
-        <w:rPr>
-          <w:rFonts w:ascii="Times New Roman" w:hAnsi="Times New Roman" w:cs="Times New Roman"/>
-          <w:i/>
-          <w:sz w:val="28"/>
-          <w:szCs w:val="28"/>
-        </w:rPr>
-        <w:t xml:space="preserve">Рис. 6 - получить ленту по </w:t>
+          <v:shape id="_x0000_i1030" type="#_x0000_t75" style="width:466.8pt;height:371.4pt">
+            <v:imagedata r:id="rId10" o:title="6"/>
+          </v:shape>
+        </w:pict>
+      </w:r>
+    </w:p>
+    <w:p>
+      <w:pPr>
+        <w:jc w:val="center"/>
+        <w:rPr>
+          <w:rFonts w:ascii="Times New Roman" w:hAnsi="Times New Roman" w:cs="Times New Roman"/>
+          <w:i/>
+          <w:sz w:val="28"/>
+          <w:szCs w:val="28"/>
+        </w:rPr>
+      </w:pPr>
+      <w:r>
+        <w:rPr>
+          <w:rFonts w:ascii="Times New Roman" w:hAnsi="Times New Roman" w:cs="Times New Roman"/>
+          <w:i/>
+          <w:sz w:val="28"/>
+          <w:szCs w:val="28"/>
+        </w:rPr>
+        <w:t>Рис. 7</w:t>
+      </w:r>
+      <w:r>
+        <w:rPr>
+          <w:rFonts w:ascii="Times New Roman" w:hAnsi="Times New Roman" w:cs="Times New Roman"/>
+          <w:i/>
+          <w:sz w:val="28"/>
+          <w:szCs w:val="28"/>
+        </w:rPr>
+        <w:t xml:space="preserve"> - получить ленту по </w:t>
       </w:r>
       <w:r>
         <w:rPr>
@@ -337,30 +467,39 @@
         </w:rPr>
         <w:lastRenderedPageBreak/>
         <w:pict>
-          <v:shape id="_x0000_i1031" type="#_x0000_t75" style="width:467.5pt;height:368.35pt">
-            <v:imagedata r:id="rId10" o:title="7"/>
-          </v:shape>
-        </w:pict>
-      </w:r>
-    </w:p>
-    <w:p>
-      <w:pPr>
-        <w:jc w:val="center"/>
-        <w:rPr>
-          <w:rFonts w:ascii="Times New Roman" w:hAnsi="Times New Roman" w:cs="Times New Roman"/>
-          <w:i/>
-          <w:sz w:val="28"/>
-          <w:szCs w:val="28"/>
-        </w:rPr>
-      </w:pPr>
-      <w:r>
-        <w:rPr>
-          <w:rFonts w:ascii="Times New Roman" w:hAnsi="Times New Roman" w:cs="Times New Roman"/>
-          <w:i/>
-          <w:sz w:val="28"/>
-          <w:szCs w:val="28"/>
-        </w:rPr>
-        <w:t xml:space="preserve">Рис. 7 - </w:t>
+          <v:shape id="_x0000_i1031" type="#_x0000_t75" style="width:467.4pt;height:368.4pt">
+            <v:imagedata r:id="rId11" o:title="7"/>
+          </v:shape>
+        </w:pict>
+      </w:r>
+    </w:p>
+    <w:p>
+      <w:pPr>
+        <w:jc w:val="center"/>
+        <w:rPr>
+          <w:rFonts w:ascii="Times New Roman" w:hAnsi="Times New Roman" w:cs="Times New Roman"/>
+          <w:i/>
+          <w:sz w:val="28"/>
+          <w:szCs w:val="28"/>
+        </w:rPr>
+      </w:pPr>
+      <w:r>
+        <w:rPr>
+          <w:rFonts w:ascii="Times New Roman" w:hAnsi="Times New Roman" w:cs="Times New Roman"/>
+          <w:i/>
+          <w:sz w:val="28"/>
+          <w:szCs w:val="28"/>
+        </w:rPr>
+        <w:t>Рис. 8</w:t>
+      </w:r>
+      <w:r>
+        <w:rPr>
+          <w:rFonts w:ascii="Times New Roman" w:hAnsi="Times New Roman" w:cs="Times New Roman"/>
+          <w:i/>
+          <w:sz w:val="28"/>
+          <w:szCs w:val="28"/>
+        </w:rPr>
+        <w:t xml:space="preserve"> - </w:t>
       </w:r>
       <w:r>
         <w:rPr>
@@ -382,6 +521,17 @@
           <w:szCs w:val="28"/>
         </w:rPr>
       </w:pPr>
+    </w:p>
+    <w:p>
+      <w:pPr>
+        <w:jc w:val="center"/>
+        <w:rPr>
+          <w:rFonts w:ascii="Times New Roman" w:hAnsi="Times New Roman" w:cs="Times New Roman"/>
+          <w:i/>
+          <w:sz w:val="28"/>
+          <w:szCs w:val="28"/>
+        </w:rPr>
+      </w:pPr>
       <w:r>
         <w:rPr>
           <w:rFonts w:ascii="Times New Roman" w:hAnsi="Times New Roman" w:cs="Times New Roman"/>
@@ -391,50 +541,30 @@
         </w:rPr>
         <w:lastRenderedPageBreak/>
         <w:pict>
-          <v:shape id="_x0000_i1032" type="#_x0000_t75" style="width:466.95pt;height:371.5pt">
-            <v:imagedata r:id="rId11" o:title="8"/>
-          </v:shape>
-        </w:pict>
-      </w:r>
-    </w:p>
-    <w:p>
-      <w:pPr>
-        <w:jc w:val="center"/>
-        <w:rPr>
-          <w:rFonts w:ascii="Times New Roman" w:hAnsi="Times New Roman" w:cs="Times New Roman"/>
-          <w:i/>
-          <w:sz w:val="28"/>
-          <w:szCs w:val="28"/>
-        </w:rPr>
-      </w:pPr>
-      <w:r>
-        <w:rPr>
-          <w:rFonts w:ascii="Times New Roman" w:hAnsi="Times New Roman" w:cs="Times New Roman"/>
-          <w:i/>
-          <w:sz w:val="28"/>
-          <w:szCs w:val="28"/>
-        </w:rPr>
-        <w:t xml:space="preserve">Рис. 8 – </w:t>
-      </w:r>
-      <w:r>
-        <w:rPr>
-          <w:rFonts w:ascii="Times New Roman" w:hAnsi="Times New Roman" w:cs="Times New Roman"/>
-          <w:i/>
-          <w:sz w:val="28"/>
-          <w:szCs w:val="28"/>
-        </w:rPr>
-        <w:t>убрать</w:t>
-      </w:r>
-      <w:bookmarkStart w:id="0" w:name="_GoBack"/>
-      <w:bookmarkEnd w:id="0"/>
-      <w:r>
-        <w:rPr>
-          <w:rFonts w:ascii="Times New Roman" w:hAnsi="Times New Roman" w:cs="Times New Roman"/>
-          <w:i/>
-          <w:sz w:val="28"/>
-          <w:szCs w:val="28"/>
-        </w:rPr>
-        <w:t xml:space="preserve"> лайк</w:t>
+          <v:shape id="_x0000_i1032" type="#_x0000_t75" style="width:467.4pt;height:369.6pt">
+            <v:imagedata r:id="rId12" o:title="9"/>
+          </v:shape>
+        </w:pict>
+      </w:r>
+    </w:p>
+    <w:p>
+      <w:pPr>
+        <w:jc w:val="center"/>
+        <w:rPr>
+          <w:rFonts w:ascii="Times New Roman" w:hAnsi="Times New Roman" w:cs="Times New Roman"/>
+          <w:i/>
+          <w:sz w:val="28"/>
+          <w:szCs w:val="28"/>
+        </w:rPr>
+      </w:pPr>
+      <w:r>
+        <w:rPr>
+          <w:rFonts w:ascii="Times New Roman" w:hAnsi="Times New Roman" w:cs="Times New Roman"/>
+          <w:i/>
+          <w:sz w:val="28"/>
+          <w:szCs w:val="28"/>
+        </w:rPr>
+        <w:t>Рис. 9 – удалить услугу</w:t>
       </w:r>
     </w:p>
     <w:p>
@@ -456,30 +586,93 @@
         </w:rPr>
         <w:lastRenderedPageBreak/>
         <w:pict>
-          <v:shape id="_x0000_i1033" type="#_x0000_t75" style="width:467.5pt;height:369.4pt">
-            <v:imagedata r:id="rId12" o:title="9"/>
-          </v:shape>
-        </w:pict>
-      </w:r>
-    </w:p>
-    <w:p>
-      <w:pPr>
-        <w:jc w:val="center"/>
-        <w:rPr>
-          <w:rFonts w:ascii="Times New Roman" w:hAnsi="Times New Roman" w:cs="Times New Roman"/>
-          <w:i/>
-          <w:sz w:val="28"/>
-          <w:szCs w:val="28"/>
-        </w:rPr>
-      </w:pPr>
-      <w:r>
-        <w:rPr>
-          <w:rFonts w:ascii="Times New Roman" w:hAnsi="Times New Roman" w:cs="Times New Roman"/>
-          <w:i/>
-          <w:sz w:val="28"/>
-          <w:szCs w:val="28"/>
-        </w:rPr>
-        <w:t>Рис. 9 – удалить услугу</w:t>
+          <v:shape id="_x0000_i1033" type="#_x0000_t75" style="width:467.4pt;height:373.2pt">
+            <v:imagedata r:id="rId13" o:title="10"/>
+          </v:shape>
+        </w:pict>
+      </w:r>
+    </w:p>
+    <w:p>
+      <w:pPr>
+        <w:jc w:val="center"/>
+        <w:rPr>
+          <w:rFonts w:ascii="Times New Roman" w:hAnsi="Times New Roman" w:cs="Times New Roman"/>
+          <w:i/>
+          <w:sz w:val="28"/>
+          <w:szCs w:val="28"/>
+        </w:rPr>
+      </w:pPr>
+      <w:r>
+        <w:rPr>
+          <w:rFonts w:ascii="Times New Roman" w:hAnsi="Times New Roman" w:cs="Times New Roman"/>
+          <w:i/>
+          <w:sz w:val="28"/>
+          <w:szCs w:val="28"/>
+        </w:rPr>
+        <w:t xml:space="preserve">Рис. 10 - </w:t>
+      </w:r>
+      <w:r>
+        <w:rPr>
+          <w:rFonts w:ascii="Times New Roman" w:hAnsi="Times New Roman" w:cs="Times New Roman"/>
+          <w:i/>
+          <w:sz w:val="28"/>
+          <w:szCs w:val="28"/>
+        </w:rPr>
+        <w:t>зарегистрировать нового пользователя</w:t>
+      </w:r>
+    </w:p>
+    <w:p>
+      <w:pPr>
+        <w:jc w:val="center"/>
+        <w:rPr>
+          <w:rFonts w:ascii="Times New Roman" w:hAnsi="Times New Roman" w:cs="Times New Roman"/>
+          <w:i/>
+          <w:sz w:val="28"/>
+          <w:szCs w:val="28"/>
+        </w:rPr>
+      </w:pPr>
+      <w:r>
+        <w:rPr>
+          <w:rFonts w:ascii="Times New Roman" w:hAnsi="Times New Roman" w:cs="Times New Roman"/>
+          <w:i/>
+          <w:sz w:val="28"/>
+          <w:szCs w:val="28"/>
+        </w:rPr>
+        <w:pict>
+          <v:shape id="_x0000_i1034" type="#_x0000_t75" style="width:466.8pt;height:204.6pt">
+            <v:imagedata r:id="rId14" o:title="11"/>
+          </v:shape>
+        </w:pict>
+      </w:r>
+    </w:p>
+    <w:p>
+      <w:pPr>
+        <w:jc w:val="center"/>
+        <w:rPr>
+          <w:rFonts w:ascii="Times New Roman" w:hAnsi="Times New Roman" w:cs="Times New Roman"/>
+          <w:i/>
+          <w:sz w:val="28"/>
+          <w:szCs w:val="28"/>
+        </w:rPr>
+      </w:pPr>
+      <w:r>
+        <w:rPr>
+          <w:rFonts w:ascii="Times New Roman" w:hAnsi="Times New Roman" w:cs="Times New Roman"/>
+          <w:i/>
+          <w:sz w:val="28"/>
+          <w:szCs w:val="28"/>
+        </w:rPr>
+        <w:t xml:space="preserve">Рис. 11 – изменения в таблице </w:t>
+      </w:r>
+      <w:r>
+        <w:rPr>
+          <w:rFonts w:ascii="Times New Roman" w:hAnsi="Times New Roman" w:cs="Times New Roman"/>
+          <w:i/>
+          <w:sz w:val="28"/>
+          <w:szCs w:val="28"/>
+          <w:lang w:val="en-US"/>
+        </w:rPr>
+        <w:t>users</w:t>
       </w:r>
     </w:p>
     <w:p>
@@ -501,83 +694,30 @@
         </w:rPr>
         <w:lastRenderedPageBreak/>
         <w:pict>
-          <v:shape id="_x0000_i1034" type="#_x0000_t75" style="width:467.5pt;height:373.05pt">
-            <v:imagedata r:id="rId13" o:title="10"/>
-          </v:shape>
-        </w:pict>
-      </w:r>
-    </w:p>
-    <w:p>
-      <w:pPr>
-        <w:jc w:val="center"/>
-        <w:rPr>
-          <w:rFonts w:ascii="Times New Roman" w:hAnsi="Times New Roman" w:cs="Times New Roman"/>
-          <w:i/>
-          <w:sz w:val="28"/>
-          <w:szCs w:val="28"/>
-        </w:rPr>
-      </w:pPr>
-      <w:r>
-        <w:rPr>
-          <w:rFonts w:ascii="Times New Roman" w:hAnsi="Times New Roman" w:cs="Times New Roman"/>
-          <w:i/>
-          <w:sz w:val="28"/>
-          <w:szCs w:val="28"/>
-        </w:rPr>
-        <w:t xml:space="preserve">Рис. 10 - </w:t>
-      </w:r>
-      <w:r>
-        <w:rPr>
-          <w:rFonts w:ascii="Times New Roman" w:hAnsi="Times New Roman" w:cs="Times New Roman"/>
-          <w:i/>
-          <w:sz w:val="28"/>
-          <w:szCs w:val="28"/>
-        </w:rPr>
-        <w:t>зарегистрировать нового пользователя</w:t>
-      </w:r>
-    </w:p>
-    <w:p>
-      <w:pPr>
-        <w:jc w:val="center"/>
-        <w:rPr>
-          <w:rFonts w:ascii="Times New Roman" w:hAnsi="Times New Roman" w:cs="Times New Roman"/>
-          <w:i/>
-          <w:sz w:val="28"/>
-          <w:szCs w:val="28"/>
-        </w:rPr>
-      </w:pPr>
-      <w:r>
-        <w:rPr>
-          <w:rFonts w:ascii="Times New Roman" w:hAnsi="Times New Roman" w:cs="Times New Roman"/>
-          <w:i/>
-          <w:sz w:val="28"/>
-          <w:szCs w:val="28"/>
-        </w:rPr>
-        <w:pict>
-          <v:shape id="_x0000_i1035" type="#_x0000_t75" style="width:466.95pt;height:204.5pt">
-            <v:imagedata r:id="rId14" o:title="11"/>
-          </v:shape>
-        </w:pict>
-      </w:r>
-    </w:p>
-    <w:p>
-      <w:pPr>
-        <w:jc w:val="center"/>
-        <w:rPr>
-          <w:rFonts w:ascii="Times New Roman" w:hAnsi="Times New Roman" w:cs="Times New Roman"/>
-          <w:i/>
-          <w:sz w:val="28"/>
-          <w:szCs w:val="28"/>
-        </w:rPr>
-      </w:pPr>
-      <w:r>
-        <w:rPr>
-          <w:rFonts w:ascii="Times New Roman" w:hAnsi="Times New Roman" w:cs="Times New Roman"/>
-          <w:i/>
-          <w:sz w:val="28"/>
-          <w:szCs w:val="28"/>
-        </w:rPr>
-        <w:t xml:space="preserve">Рис. 11 – изменения в таблице </w:t>
+          <v:shape id="_x0000_i1035" type="#_x0000_t75" style="width:466.8pt;height:168pt">
+            <v:imagedata r:id="rId15" o:title="12"/>
+          </v:shape>
+        </w:pict>
+      </w:r>
+    </w:p>
+    <w:p>
+      <w:pPr>
+        <w:jc w:val="center"/>
+        <w:rPr>
+          <w:rFonts w:ascii="Times New Roman" w:hAnsi="Times New Roman" w:cs="Times New Roman"/>
+          <w:i/>
+          <w:sz w:val="28"/>
+          <w:szCs w:val="28"/>
+        </w:rPr>
+      </w:pPr>
+      <w:r>
+        <w:rPr>
+          <w:rFonts w:ascii="Times New Roman" w:hAnsi="Times New Roman" w:cs="Times New Roman"/>
+          <w:i/>
+          <w:sz w:val="28"/>
+          <w:szCs w:val="28"/>
+        </w:rPr>
+        <w:t xml:space="preserve">Рис. 12 – изменения в таблице </w:t>
       </w:r>
       <w:r>
         <w:rPr>
@@ -587,7 +727,62 @@
           <w:szCs w:val="28"/>
           <w:lang w:val="en-US"/>
         </w:rPr>
-        <w:t>users</w:t>
+        <w:t>services</w:t>
+      </w:r>
+    </w:p>
+    <w:p>
+      <w:pPr>
+        <w:jc w:val="center"/>
+        <w:rPr>
+          <w:rFonts w:ascii="Times New Roman" w:hAnsi="Times New Roman" w:cs="Times New Roman"/>
+          <w:i/>
+          <w:sz w:val="28"/>
+          <w:szCs w:val="28"/>
+        </w:rPr>
+      </w:pPr>
+      <w:r>
+        <w:rPr>
+          <w:rFonts w:ascii="Times New Roman" w:hAnsi="Times New Roman" w:cs="Times New Roman"/>
+          <w:i/>
+          <w:sz w:val="28"/>
+          <w:szCs w:val="28"/>
+        </w:rPr>
+        <w:pict>
+          <v:shape id="_x0000_i1036" type="#_x0000_t75" style="width:467.4pt;height:390pt">
+            <v:imagedata r:id="rId16" o:title="13"/>
+          </v:shape>
+        </w:pict>
+      </w:r>
+    </w:p>
+    <w:p>
+      <w:pPr>
+        <w:jc w:val="center"/>
+        <w:rPr>
+          <w:rFonts w:ascii="Times New Roman" w:hAnsi="Times New Roman" w:cs="Times New Roman"/>
+          <w:i/>
+          <w:sz w:val="28"/>
+          <w:szCs w:val="28"/>
+          <w:lang w:val="en-US"/>
+        </w:rPr>
+      </w:pPr>
+      <w:r>
+        <w:rPr>
+          <w:rFonts w:ascii="Times New Roman" w:hAnsi="Times New Roman" w:cs="Times New Roman"/>
+          <w:i/>
+          <w:sz w:val="28"/>
+          <w:szCs w:val="28"/>
+        </w:rPr>
+        <w:t xml:space="preserve">Рис. 13 – изменения в таблице </w:t>
+      </w:r>
+      <w:r>
+        <w:rPr>
+          <w:rFonts w:ascii="Times New Roman" w:hAnsi="Times New Roman" w:cs="Times New Roman"/>
+          <w:i/>
+          <w:sz w:val="28"/>
+          <w:szCs w:val="28"/>
+          <w:lang w:val="en-US"/>
+        </w:rPr>
+        <w:t>likes</w:t>
       </w:r>
     </w:p>
     <w:p>
@@ -609,107 +804,24 @@
         </w:rPr>
         <w:lastRenderedPageBreak/>
         <w:pict>
-          <v:shape id="_x0000_i1036" type="#_x0000_t75" style="width:466.45pt;height:168pt">
-            <v:imagedata r:id="rId15" o:title="12"/>
-          </v:shape>
-        </w:pict>
-      </w:r>
-    </w:p>
-    <w:p>
-      <w:pPr>
-        <w:jc w:val="center"/>
-        <w:rPr>
-          <w:rFonts w:ascii="Times New Roman" w:hAnsi="Times New Roman" w:cs="Times New Roman"/>
-          <w:i/>
-          <w:sz w:val="28"/>
-          <w:szCs w:val="28"/>
-        </w:rPr>
-      </w:pPr>
-      <w:r>
-        <w:rPr>
-          <w:rFonts w:ascii="Times New Roman" w:hAnsi="Times New Roman" w:cs="Times New Roman"/>
-          <w:i/>
-          <w:sz w:val="28"/>
-          <w:szCs w:val="28"/>
-        </w:rPr>
-        <w:t xml:space="preserve">Рис. 12 – изменения в таблице </w:t>
-      </w:r>
-      <w:r>
-        <w:rPr>
-          <w:rFonts w:ascii="Times New Roman" w:hAnsi="Times New Roman" w:cs="Times New Roman"/>
-          <w:i/>
-          <w:sz w:val="28"/>
-          <w:szCs w:val="28"/>
-          <w:lang w:val="en-US"/>
-        </w:rPr>
-        <w:t>services</w:t>
-      </w:r>
-    </w:p>
-    <w:p>
-      <w:pPr>
-        <w:jc w:val="center"/>
-        <w:rPr>
-          <w:rFonts w:ascii="Times New Roman" w:hAnsi="Times New Roman" w:cs="Times New Roman"/>
-          <w:i/>
-          <w:sz w:val="28"/>
-          <w:szCs w:val="28"/>
-        </w:rPr>
-      </w:pPr>
-      <w:r>
-        <w:rPr>
-          <w:rFonts w:ascii="Times New Roman" w:hAnsi="Times New Roman" w:cs="Times New Roman"/>
-          <w:i/>
-          <w:sz w:val="28"/>
-          <w:szCs w:val="28"/>
-        </w:rPr>
-        <w:pict>
-          <v:shape id="_x0000_i1037" type="#_x0000_t75" style="width:467.5pt;height:389.75pt">
-            <v:imagedata r:id="rId16" o:title="13"/>
-          </v:shape>
-        </w:pict>
-      </w:r>
-    </w:p>
-    <w:p>
-      <w:pPr>
-        <w:jc w:val="center"/>
-        <w:rPr>
-          <w:rFonts w:ascii="Times New Roman" w:hAnsi="Times New Roman" w:cs="Times New Roman"/>
-          <w:i/>
-          <w:sz w:val="28"/>
-          <w:szCs w:val="28"/>
-          <w:lang w:val="en-US"/>
-        </w:rPr>
-      </w:pPr>
-      <w:r>
-        <w:rPr>
-          <w:rFonts w:ascii="Times New Roman" w:hAnsi="Times New Roman" w:cs="Times New Roman"/>
-          <w:i/>
-          <w:sz w:val="28"/>
-          <w:szCs w:val="28"/>
-        </w:rPr>
-        <w:t xml:space="preserve">Рис. 13 – изменения в таблице </w:t>
-      </w:r>
-      <w:r>
-        <w:rPr>
-          <w:rFonts w:ascii="Times New Roman" w:hAnsi="Times New Roman" w:cs="Times New Roman"/>
-          <w:i/>
-          <w:sz w:val="28"/>
-          <w:szCs w:val="28"/>
-          <w:lang w:val="en-US"/>
-        </w:rPr>
-        <w:t>likes</w:t>
-      </w:r>
-    </w:p>
-    <w:p>
-      <w:pPr>
-        <w:jc w:val="center"/>
-        <w:rPr>
-          <w:rFonts w:ascii="Times New Roman" w:hAnsi="Times New Roman" w:cs="Times New Roman"/>
-          <w:i/>
-          <w:sz w:val="28"/>
-          <w:szCs w:val="28"/>
-        </w:rPr>
-      </w:pPr>
+          <v:shape id="_x0000_i1037" type="#_x0000_t75" style="width:466.8pt;height:208.2pt">
+            <v:imagedata r:id="rId17" o:title="14"/>
+          </v:shape>
+        </w:pict>
+      </w:r>
+      <w:r>
+        <w:rPr>
+          <w:rFonts w:ascii="Times New Roman" w:hAnsi="Times New Roman" w:cs="Times New Roman"/>
+          <w:i/>
+          <w:sz w:val="28"/>
+          <w:szCs w:val="28"/>
+        </w:rPr>
+        <w:pict>
+          <v:shape id="_x0000_i1038" type="#_x0000_t75" style="width:467.4pt;height:207.6pt">
+            <v:imagedata r:id="rId18" o:title="14"/>
+          </v:shape>
+        </w:pict>
+      </w:r>
       <w:r>
         <w:rPr>
           <w:rFonts w:ascii="Times New Roman" w:hAnsi="Times New Roman" w:cs="Times New Roman"/>
@@ -719,24 +831,42 @@
         </w:rPr>
         <w:lastRenderedPageBreak/>
         <w:pict>
-          <v:shape id="_x0000_i1038" type="#_x0000_t75" style="width:466.95pt;height:208.15pt">
-            <v:imagedata r:id="rId17" o:title="14"/>
-          </v:shape>
-        </w:pict>
-      </w:r>
-      <w:r>
-        <w:rPr>
-          <w:rFonts w:ascii="Times New Roman" w:hAnsi="Times New Roman" w:cs="Times New Roman"/>
-          <w:i/>
-          <w:sz w:val="28"/>
-          <w:szCs w:val="28"/>
-        </w:rPr>
-        <w:pict>
-          <v:shape id="_x0000_i1039" type="#_x0000_t75" style="width:467.5pt;height:207.65pt">
-            <v:imagedata r:id="rId18" o:title="14"/>
-          </v:shape>
-        </w:pict>
-      </w:r>
+          <v:shape id="_x0000_i1039" type="#_x0000_t75" style="width:467.4pt;height:320.4pt">
+            <v:imagedata r:id="rId19" o:title="14"/>
+          </v:shape>
+        </w:pict>
+      </w:r>
+    </w:p>
+    <w:p>
+      <w:pPr>
+        <w:jc w:val="center"/>
+        <w:rPr>
+          <w:rFonts w:ascii="Times New Roman" w:hAnsi="Times New Roman" w:cs="Times New Roman"/>
+          <w:i/>
+          <w:sz w:val="28"/>
+          <w:szCs w:val="28"/>
+        </w:rPr>
+      </w:pPr>
+      <w:r>
+        <w:rPr>
+          <w:rFonts w:ascii="Times New Roman" w:hAnsi="Times New Roman" w:cs="Times New Roman"/>
+          <w:i/>
+          <w:sz w:val="28"/>
+          <w:szCs w:val="28"/>
+        </w:rPr>
+        <w:t>Рис. 14 – модели</w:t>
+      </w:r>
+    </w:p>
+    <w:p>
+      <w:pPr>
+        <w:jc w:val="center"/>
+        <w:rPr>
+          <w:rFonts w:ascii="Times New Roman" w:hAnsi="Times New Roman" w:cs="Times New Roman"/>
+          <w:i/>
+          <w:sz w:val="28"/>
+          <w:szCs w:val="28"/>
+        </w:rPr>
+      </w:pPr>
       <w:r>
         <w:rPr>
           <w:rFonts w:ascii="Times New Roman" w:hAnsi="Times New Roman" w:cs="Times New Roman"/>
@@ -746,30 +876,43 @@
         </w:rPr>
         <w:lastRenderedPageBreak/>
         <w:pict>
-          <v:shape id="_x0000_i1040" type="#_x0000_t75" style="width:467.5pt;height:320.35pt">
-            <v:imagedata r:id="rId19" o:title="14"/>
-          </v:shape>
-        </w:pict>
-      </w:r>
-    </w:p>
-    <w:p>
-      <w:pPr>
-        <w:jc w:val="center"/>
-        <w:rPr>
-          <w:rFonts w:ascii="Times New Roman" w:hAnsi="Times New Roman" w:cs="Times New Roman"/>
-          <w:i/>
-          <w:sz w:val="28"/>
-          <w:szCs w:val="28"/>
-        </w:rPr>
-      </w:pPr>
-      <w:r>
-        <w:rPr>
-          <w:rFonts w:ascii="Times New Roman" w:hAnsi="Times New Roman" w:cs="Times New Roman"/>
-          <w:i/>
-          <w:sz w:val="28"/>
-          <w:szCs w:val="28"/>
-        </w:rPr>
-        <w:t>Рис. 14 – модели</w:t>
+          <v:shape id="_x0000_i1040" type="#_x0000_t75" style="width:467.4pt;height:302.4pt">
+            <v:imagedata r:id="rId20" o:title="15"/>
+          </v:shape>
+        </w:pict>
+      </w:r>
+      <w:r>
+        <w:rPr>
+          <w:rFonts w:ascii="Times New Roman" w:hAnsi="Times New Roman" w:cs="Times New Roman"/>
+          <w:i/>
+          <w:sz w:val="28"/>
+          <w:szCs w:val="28"/>
+        </w:rPr>
+        <w:pict>
+          <v:shape id="_x0000_i1041" type="#_x0000_t75" style="width:466.8pt;height:222.6pt">
+            <v:imagedata r:id="rId21" o:title="15"/>
+          </v:shape>
+        </w:pict>
+      </w:r>
+    </w:p>
+    <w:p>
+      <w:pPr>
+        <w:jc w:val="center"/>
+        <w:rPr>
+          <w:rFonts w:ascii="Times New Roman" w:hAnsi="Times New Roman" w:cs="Times New Roman"/>
+          <w:i/>
+          <w:sz w:val="28"/>
+          <w:szCs w:val="28"/>
+        </w:rPr>
+      </w:pPr>
+      <w:r>
+        <w:rPr>
+          <w:rFonts w:ascii="Times New Roman" w:hAnsi="Times New Roman" w:cs="Times New Roman"/>
+          <w:i/>
+          <w:sz w:val="28"/>
+          <w:szCs w:val="28"/>
+        </w:rPr>
+        <w:t>Рис. 15 – сериализаторы</w:t>
       </w:r>
     </w:p>
     <w:p>
@@ -791,43 +934,39 @@
         </w:rPr>
         <w:lastRenderedPageBreak/>
         <w:pict>
-          <v:shape id="_x0000_i1041" type="#_x0000_t75" style="width:467.5pt;height:302.6pt">
-            <v:imagedata r:id="rId20" o:title="15"/>
-          </v:shape>
-        </w:pict>
-      </w:r>
-      <w:r>
-        <w:rPr>
-          <w:rFonts w:ascii="Times New Roman" w:hAnsi="Times New Roman" w:cs="Times New Roman"/>
-          <w:i/>
-          <w:sz w:val="28"/>
-          <w:szCs w:val="28"/>
-        </w:rPr>
-        <w:pict>
-          <v:shape id="_x0000_i1042" type="#_x0000_t75" style="width:466.95pt;height:222.8pt">
-            <v:imagedata r:id="rId21" o:title="15"/>
-          </v:shape>
-        </w:pict>
-      </w:r>
-    </w:p>
-    <w:p>
-      <w:pPr>
-        <w:jc w:val="center"/>
-        <w:rPr>
-          <w:rFonts w:ascii="Times New Roman" w:hAnsi="Times New Roman" w:cs="Times New Roman"/>
-          <w:i/>
-          <w:sz w:val="28"/>
-          <w:szCs w:val="28"/>
-        </w:rPr>
-      </w:pPr>
-      <w:r>
-        <w:rPr>
-          <w:rFonts w:ascii="Times New Roman" w:hAnsi="Times New Roman" w:cs="Times New Roman"/>
-          <w:i/>
-          <w:sz w:val="28"/>
-          <w:szCs w:val="28"/>
-        </w:rPr>
-        <w:t>Рис. 15 – сериализаторы</w:t>
+          <v:shape id="_x0000_i1042" type="#_x0000_t75" style="width:424.8pt;height:195pt">
+            <v:imagedata r:id="rId22" o:title="16"/>
+          </v:shape>
+        </w:pict>
+      </w:r>
+    </w:p>
+    <w:p>
+      <w:pPr>
+        <w:jc w:val="center"/>
+        <w:rPr>
+          <w:rFonts w:ascii="Times New Roman" w:hAnsi="Times New Roman" w:cs="Times New Roman"/>
+          <w:i/>
+          <w:sz w:val="28"/>
+          <w:szCs w:val="28"/>
+        </w:rPr>
+      </w:pPr>
+      <w:r>
+        <w:rPr>
+          <w:rFonts w:ascii="Times New Roman" w:hAnsi="Times New Roman" w:cs="Times New Roman"/>
+          <w:i/>
+          <w:sz w:val="28"/>
+          <w:szCs w:val="28"/>
+        </w:rPr>
+        <w:t>Рис. 16 - функция</w:t>
+      </w:r>
+      <w:r>
+        <w:rPr>
+          <w:rFonts w:ascii="Times New Roman" w:hAnsi="Times New Roman" w:cs="Times New Roman"/>
+          <w:i/>
+          <w:sz w:val="28"/>
+          <w:szCs w:val="28"/>
+        </w:rPr>
+        <w:t>-singleton где пользователь указан константой</w:t>
       </w:r>
     </w:p>
     <w:p>
@@ -849,51 +988,11 @@
         </w:rPr>
         <w:lastRenderedPageBreak/>
         <w:pict>
-          <v:shape id="_x0000_i1043" type="#_x0000_t75" style="width:424.7pt;height:195.15pt">
-            <v:imagedata r:id="rId22" o:title="16"/>
-          </v:shape>
-        </w:pict>
-      </w:r>
-    </w:p>
-    <w:p>
-      <w:pPr>
-        <w:jc w:val="center"/>
-        <w:rPr>
-          <w:rFonts w:ascii="Times New Roman" w:hAnsi="Times New Roman" w:cs="Times New Roman"/>
-          <w:i/>
-          <w:sz w:val="28"/>
-          <w:szCs w:val="28"/>
-        </w:rPr>
-      </w:pPr>
-      <w:r>
-        <w:rPr>
-          <w:rFonts w:ascii="Times New Roman" w:hAnsi="Times New Roman" w:cs="Times New Roman"/>
-          <w:i/>
-          <w:sz w:val="28"/>
-          <w:szCs w:val="28"/>
-        </w:rPr>
-        <w:t>Рис. 16 - функция</w:t>
-      </w:r>
-      <w:r>
-        <w:rPr>
-          <w:rFonts w:ascii="Times New Roman" w:hAnsi="Times New Roman" w:cs="Times New Roman"/>
-          <w:i/>
-          <w:sz w:val="28"/>
-          <w:szCs w:val="28"/>
-        </w:rPr>
-        <w:t>-singleton где пользователь указан константой</w:t>
-      </w:r>
-    </w:p>
-    <w:p>
-      <w:pPr>
-        <w:jc w:val="center"/>
-        <w:rPr>
-          <w:rFonts w:ascii="Times New Roman" w:hAnsi="Times New Roman" w:cs="Times New Roman"/>
-          <w:i/>
-          <w:sz w:val="28"/>
-          <w:szCs w:val="28"/>
-        </w:rPr>
-      </w:pPr>
+          <v:shape id="_x0000_i1043" type="#_x0000_t75" style="width:447.6pt;height:235.2pt">
+            <v:imagedata r:id="rId23" o:title="17"/>
+          </v:shape>
+        </w:pict>
+      </w:r>
       <w:r>
         <w:rPr>
           <w:rFonts w:ascii="Times New Roman" w:hAnsi="Times New Roman" w:cs="Times New Roman"/>
@@ -903,8 +1002,8 @@
         </w:rPr>
         <w:lastRenderedPageBreak/>
         <w:pict>
-          <v:shape id="_x0000_i1044" type="#_x0000_t75" style="width:447.65pt;height:235.3pt">
-            <v:imagedata r:id="rId23" o:title="17"/>
+          <v:shape id="_x0000_i1044" type="#_x0000_t75" style="width:462.6pt;height:546.6pt">
+            <v:imagedata r:id="rId24" o:title="17"/>
           </v:shape>
         </w:pict>
       </w:r>
@@ -917,21 +1016,7 @@
         </w:rPr>
         <w:lastRenderedPageBreak/>
         <w:pict>
-          <v:shape id="_x0000_i1045" type="#_x0000_t75" style="width:462.8pt;height:546.8pt">
-            <v:imagedata r:id="rId24" o:title="17"/>
-          </v:shape>
-        </w:pict>
-      </w:r>
-      <w:r>
-        <w:rPr>
-          <w:rFonts w:ascii="Times New Roman" w:hAnsi="Times New Roman" w:cs="Times New Roman"/>
-          <w:i/>
-          <w:sz w:val="28"/>
-          <w:szCs w:val="28"/>
-        </w:rPr>
-        <w:lastRenderedPageBreak/>
-        <w:pict>
-          <v:shape id="_x0000_i1046" type="#_x0000_t75" style="width:460.15pt;height:549.4pt">
+          <v:shape id="_x0000_i1045" type="#_x0000_t75" style="width:462pt;height:552pt">
             <v:imagedata r:id="rId25" o:title="17"/>
           </v:shape>
         </w:pict>

</xml_diff>